<commit_message>
Fix card counts to 80/6, update social meta tags, fix 3-in-a-row tablet grid, and make prototype CTA responsive
</commit_message>
<xml_diff>
--- a/Made_You_Say_It_Rules_English_A4.docx
+++ b/Made_You_Say_It_Rules_English_A4.docx
@@ -1352,7 +1352,7 @@
                 <w:sz w:val="13"/>
                 <w:szCs w:val="13"/>
               </w:rPr>
-              <w:t xml:space="preserve">When the last card is drawn, complete the current round. Players who cannot draw play 1 card from hand.
+              <w:t xml:space="preserve">When the Draw Pile is empty, keep playing without drawing. On your turn, play or pass 1 card from your hand. When everyone has no cards left, the game ends.
 </w:t>
             </w:r>
             <w:r>
@@ -1373,18 +1373,18 @@
                 <w:sz w:val="13"/>
                 <w:szCs w:val="13"/>
               </w:rPr>
-              <w:t xml:space="preserve">Sum all printed points on cards in your Score Pile. </w:t>
-            </w:r>
-            <w:r>
-              <w:rPr>
-                <w:rFonts w:ascii="Segoe UI" w:cs="Segoe UI" w:eastAsia="Segoe UI" w:hAnsi="Segoe UI"/>
-                <w:b/>
-                <w:bCs/>
-                <w:color w:val="0F172A"/>
-                <w:sz w:val="13"/>
-                <w:szCs w:val="13"/>
-              </w:rPr>
-              <w:t xml:space="preserve">Highest score wins!</w:t>
+              <w:t xml:space="preserve">Count the points in your Score Pile. </w:t>
+            </w:r>
+            <w:r>
+              <w:rPr>
+                <w:rFonts w:ascii="Segoe UI" w:cs="Segoe UI" w:eastAsia="Segoe UI" w:hAnsi="Segoe UI"/>
+                <w:b/>
+                <w:bCs/>
+                <w:color w:val="0F172A"/>
+                <w:sz w:val="13"/>
+                <w:szCs w:val="13"/>
+              </w:rPr>
+              <w:t xml:space="preserve">The player with the most points wins!</w:t>
             </w:r>
           </w:p>
           <w:tbl>
@@ -1440,7 +1440,7 @@
                       <w:sz w:val="12"/>
                       <w:szCs w:val="12"/>
                     </w:rPr>
-                    <w:t xml:space="preserve">Everyone should have fun! You can always pass without penalty. Never pressure anyone to reveal a real crush, private secrets, touch another player, or do anything dangerous, sexual, humiliating, or uncomfortable.</w:t>
+                    <w:t xml:space="preserve">The goal is not to win, it’s to have fun and make good memories. You can always pass. Never pressure anyone to reveal a real crush, private information, touch another person, or do anything dangerous, sexual, humiliating, or genuinely uncomfortable.</w:t>
                   </w:r>
                 </w:p>
               </w:tc>

</xml_diff>

<commit_message>
Update End of Game rule, improve mobile card gallery badges, and trim Who Its For to 3 and 3
</commit_message>
<xml_diff>
--- a/Made_You_Say_It_Rules_English_A4.docx
+++ b/Made_You_Say_It_Rules_English_A4.docx
@@ -1352,7 +1352,7 @@
                 <w:sz w:val="13"/>
                 <w:szCs w:val="13"/>
               </w:rPr>
-              <w:t xml:space="preserve">When the Draw Pile is empty, keep playing without drawing. On your turn, play or pass 1 card from your hand. When everyone has no cards left, the game ends.
+              <w:t xml:space="preserve">When the Draw Pile is empty, play or pass 1 card each turn until everyone has no cards left.
 </w:t>
             </w:r>
             <w:r>
@@ -1384,7 +1384,28 @@
                 <w:sz w:val="13"/>
                 <w:szCs w:val="13"/>
               </w:rPr>
-              <w:t xml:space="preserve">The player with the most points wins!</w:t>
+              <w:t xml:space="preserve">The player with the most points wins!
+</w:t>
+            </w:r>
+            <w:r>
+              <w:rPr>
+                <w:rFonts w:ascii="Segoe UI" w:cs="Segoe UI" w:eastAsia="Segoe UI" w:hAnsi="Segoe UI"/>
+                <w:b/>
+                <w:bCs/>
+                <w:color w:val="0F172A"/>
+                <w:sz w:val="13"/>
+                <w:szCs w:val="13"/>
+              </w:rPr>
+              <w:t xml:space="preserve">• Lowest Score: </w:t>
+            </w:r>
+            <w:r>
+              <w:rPr>
+                <w:rFonts w:ascii="Segoe UI" w:cs="Segoe UI" w:eastAsia="Segoe UI" w:hAnsi="Segoe UI"/>
+                <w:color w:val="475569"/>
+                <w:sz w:val="13"/>
+                <w:szCs w:val="13"/>
+              </w:rPr>
+              <w:t xml:space="preserve">The player with the lowest score gets 1 question from each other player. They can answer or pass. Follow the Golden Rule!</w:t>
             </w:r>
           </w:p>
           <w:tbl>

</xml_diff>